<commit_message>
Se actualiza la informacion en el archivo de analisis
</commit_message>
<xml_diff>
--- a/Analisis.docx
+++ b/Analisis.docx
@@ -14,6 +14,7 @@
           <w:lang w:eastAsia="es-CO"/>
         </w:rPr>
       </w:pPr>
+      <w:bookmarkStart w:id="0" w:name="_Hlk232102943"/>
       <w:r>
         <w:rPr>
           <w:rFonts w:ascii="Times New Roman" w:eastAsia="Times New Roman" w:hAnsi="Times New Roman" w:cs="Times New Roman"/>
@@ -426,7 +427,6 @@
         <w:tblCellMar>
           <w:top w:w="45" w:type="dxa"/>
           <w:left w:w="107" w:type="dxa"/>
-          <w:bottom w:w="0" w:type="dxa"/>
           <w:right w:w="115" w:type="dxa"/>
         </w:tblCellMar>
         <w:tblLook w:val="04A0" w:firstRow="1" w:lastRow="0" w:firstColumn="1" w:lastColumn="0" w:noHBand="0" w:noVBand="1"/>
@@ -1064,6 +1064,9 @@
           <w:lang w:eastAsia="es-CO"/>
         </w:rPr>
       </w:pPr>
+      <w:bookmarkStart w:id="1" w:name="_Hlk232102974"/>
+      <w:bookmarkStart w:id="2" w:name="_Hlk232103101"/>
+      <w:bookmarkEnd w:id="0"/>
       <w:r>
         <w:rPr>
           <w:rFonts w:ascii="Times New Roman" w:eastAsia="Times New Roman" w:hAnsi="Times New Roman" w:cs="Times New Roman"/>
@@ -1072,18 +1075,11 @@
           <w:lang w:eastAsia="es-CO"/>
         </w:rPr>
         <w:lastRenderedPageBreak/>
-        <w:t>Comprensión inicial</w:t>
+        <w:t xml:space="preserve">Comprensión inicial del proyecto </w:t>
       </w:r>
-      <w:r>
-        <w:rPr>
-          <w:rFonts w:ascii="Times New Roman" w:eastAsia="Times New Roman" w:hAnsi="Times New Roman" w:cs="Times New Roman"/>
-          <w:color w:val="1F4E79"/>
-          <w:sz w:val="28"/>
-          <w:lang w:eastAsia="es-CO"/>
-        </w:rPr>
-        <w:t xml:space="preserve"> del proyecto </w:t>
-      </w:r>
+      <w:bookmarkEnd w:id="1"/>
     </w:p>
+    <w:bookmarkEnd w:id="2"/>
     <w:p>
       <w:pPr>
         <w:jc w:val="both"/>
@@ -1215,15 +1211,7 @@
           <w:sz w:val="22"/>
           <w:szCs w:val="22"/>
         </w:rPr>
-        <w:t xml:space="preserve">La clase Persona se propone como clase base para Jugador y </w:t>
-      </w:r>
-      <w:r>
-        <w:rPr>
-          <w:rFonts w:ascii="Times New Roman" w:hAnsi="Times New Roman" w:cs="Times New Roman"/>
-          <w:sz w:val="22"/>
-          <w:szCs w:val="22"/>
-        </w:rPr>
-        <w:t>director</w:t>
+        <w:t>La clase Persona se propone como clase base para Jugador y director</w:t>
       </w:r>
       <w:r>
         <w:rPr>
@@ -1514,7 +1502,23 @@
                 <w:sz w:val="22"/>
                 <w:szCs w:val="22"/>
               </w:rPr>
-              <w:t>Nombre, edad, nacionalidad.</w:t>
+              <w:t>Nombre,</w:t>
+            </w:r>
+            <w:r>
+              <w:rPr>
+                <w:rFonts w:ascii="Times New Roman" w:hAnsi="Times New Roman" w:cs="Times New Roman"/>
+                <w:sz w:val="22"/>
+                <w:szCs w:val="22"/>
+              </w:rPr>
+              <w:t xml:space="preserve"> apellido, </w:t>
+            </w:r>
+            <w:r>
+              <w:rPr>
+                <w:rFonts w:ascii="Times New Roman" w:hAnsi="Times New Roman" w:cs="Times New Roman"/>
+                <w:sz w:val="22"/>
+                <w:szCs w:val="22"/>
+              </w:rPr>
+              <w:t>edad, nacionalidad.</w:t>
             </w:r>
           </w:p>
         </w:tc>
@@ -1558,19 +1562,45 @@
             <w:pPr>
               <w:cnfStyle w:val="000000100000" w:firstRow="0" w:lastRow="0" w:firstColumn="0" w:lastColumn="0" w:oddVBand="0" w:evenVBand="0" w:oddHBand="1" w:evenHBand="0" w:firstRowFirstColumn="0" w:firstRowLastColumn="0" w:lastRowFirstColumn="0" w:lastRowLastColumn="0"/>
               <w:rPr>
-                <w:rFonts w:ascii="Times New Roman" w:hAnsi="Times New Roman" w:cs="Times New Roman"/>
-                <w:sz w:val="22"/>
-                <w:szCs w:val="22"/>
-              </w:rPr>
-            </w:pPr>
-            <w:r>
-              <w:rPr>
-                <w:rFonts w:ascii="Times New Roman" w:hAnsi="Times New Roman" w:cs="Times New Roman"/>
-                <w:sz w:val="22"/>
-                <w:szCs w:val="22"/>
-              </w:rPr>
-              <w:t>Dorsal, posición.</w:t>
-            </w:r>
+                <w:rStyle w:val="Textoennegrita"/>
+              </w:rPr>
+            </w:pPr>
+            <w:proofErr w:type="spellStart"/>
+            <w:r>
+              <w:rPr>
+                <w:rFonts w:ascii="Times New Roman" w:hAnsi="Times New Roman" w:cs="Times New Roman"/>
+                <w:sz w:val="22"/>
+                <w:szCs w:val="22"/>
+              </w:rPr>
+              <w:t>Numero</w:t>
+            </w:r>
+            <w:proofErr w:type="spellEnd"/>
+            <w:r>
+              <w:rPr>
+                <w:rFonts w:ascii="Times New Roman" w:hAnsi="Times New Roman" w:cs="Times New Roman"/>
+                <w:sz w:val="22"/>
+                <w:szCs w:val="22"/>
+              </w:rPr>
+              <w:t>, posición</w:t>
+            </w:r>
+            <w:r>
+              <w:rPr>
+                <w:rFonts w:ascii="Times New Roman" w:hAnsi="Times New Roman" w:cs="Times New Roman"/>
+                <w:sz w:val="22"/>
+                <w:szCs w:val="22"/>
+              </w:rPr>
+              <w:t>.</w:t>
+            </w:r>
+          </w:p>
+          <w:p>
+            <w:pPr>
+              <w:cnfStyle w:val="000000100000" w:firstRow="0" w:lastRow="0" w:firstColumn="0" w:lastColumn="0" w:oddVBand="0" w:evenVBand="0" w:oddHBand="1" w:evenHBand="0" w:firstRowFirstColumn="0" w:firstRowLastColumn="0" w:lastRowFirstColumn="0" w:lastRowLastColumn="0"/>
+              <w:rPr>
+                <w:rFonts w:ascii="Times New Roman" w:hAnsi="Times New Roman" w:cs="Times New Roman"/>
+                <w:sz w:val="22"/>
+                <w:szCs w:val="22"/>
+              </w:rPr>
+            </w:pPr>
           </w:p>
         </w:tc>
       </w:tr>
@@ -3870,6 +3900,7 @@
         <w:lang w:eastAsia="es-CO"/>
       </w:rPr>
     </w:pPr>
+    <w:bookmarkStart w:id="3" w:name="_Hlk232102899"/>
     <w:r>
       <w:rPr>
         <w:rFonts w:ascii="Times New Roman" w:eastAsia="Times New Roman" w:hAnsi="Times New Roman" w:cs="Times New Roman"/>
@@ -3898,6 +3929,7 @@
       <w:t xml:space="preserve"> </w:t>
     </w:r>
   </w:p>
+  <w:bookmarkEnd w:id="3"/>
   <w:p>
     <w:pPr>
       <w:pStyle w:val="Encabezado"/>
@@ -5088,6 +5120,7 @@
   <w:style w:type="character" w:default="1" w:styleId="Fuentedeprrafopredeter">
     <w:name w:val="Default Paragraph Font"/>
     <w:uiPriority w:val="1"/>
+    <w:semiHidden/>
     <w:unhideWhenUsed/>
   </w:style>
   <w:style w:type="table" w:default="1" w:styleId="Tablanormal">
@@ -5663,6 +5696,17 @@
     <w:uiPriority w:val="99"/>
     <w:rsid w:val="00154E32"/>
   </w:style>
+  <w:style w:type="character" w:styleId="Textoennegrita">
+    <w:name w:val="Strong"/>
+    <w:basedOn w:val="Fuentedeprrafopredeter"/>
+    <w:uiPriority w:val="22"/>
+    <w:qFormat/>
+    <w:rsid w:val="00653871"/>
+    <w:rPr>
+      <w:b/>
+      <w:bCs/>
+    </w:rPr>
+  </w:style>
 </w:styles>
 </file>
 

</xml_diff>

<commit_message>
Se actualizan documentos de entrega
</commit_message>
<xml_diff>
--- a/Analisis.docx
+++ b/Analisis.docx
@@ -314,7 +314,6 @@
           <w:lang w:eastAsia="es-CO"/>
         </w:rPr>
       </w:pPr>
-      <w:proofErr w:type="spellStart"/>
       <w:r>
         <w:rPr>
           <w:rFonts w:ascii="Times New Roman" w:eastAsia="Times New Roman" w:hAnsi="Times New Roman" w:cs="Times New Roman"/>
@@ -322,17 +321,7 @@
           <w:sz w:val="36"/>
           <w:lang w:eastAsia="es-CO"/>
         </w:rPr>
-        <w:t>MundialPOO</w:t>
-      </w:r>
-      <w:proofErr w:type="spellEnd"/>
-      <w:r>
-        <w:rPr>
-          <w:rFonts w:ascii="Times New Roman" w:eastAsia="Times New Roman" w:hAnsi="Times New Roman" w:cs="Times New Roman"/>
-          <w:color w:val="1F4E79"/>
-          <w:sz w:val="36"/>
-          <w:lang w:eastAsia="es-CO"/>
-        </w:rPr>
-        <w:t xml:space="preserve"> </w:t>
+        <w:t xml:space="preserve">MundialPOO </w:t>
       </w:r>
     </w:p>
     <w:p>
@@ -657,43 +646,7 @@
                 <w:color w:val="000000"/>
                 <w:sz w:val="21"/>
               </w:rPr>
-              <w:t xml:space="preserve">Leonardo Montes </w:t>
-            </w:r>
-            <w:proofErr w:type="spellStart"/>
-            <w:r>
-              <w:rPr>
-                <w:rFonts w:ascii="Times New Roman" w:hAnsi="Times New Roman" w:cs="Times New Roman"/>
-                <w:color w:val="000000"/>
-                <w:sz w:val="21"/>
-              </w:rPr>
-              <w:t>Marin</w:t>
-            </w:r>
-            <w:proofErr w:type="spellEnd"/>
-            <w:r>
-              <w:rPr>
-                <w:rFonts w:ascii="Times New Roman" w:hAnsi="Times New Roman" w:cs="Times New Roman"/>
-                <w:color w:val="000000"/>
-                <w:sz w:val="21"/>
-              </w:rPr>
-              <w:t xml:space="preserve"> Ing. </w:t>
-            </w:r>
-            <w:proofErr w:type="spellStart"/>
-            <w:r>
-              <w:rPr>
-                <w:rFonts w:ascii="Times New Roman" w:hAnsi="Times New Roman" w:cs="Times New Roman"/>
-                <w:color w:val="000000"/>
-                <w:sz w:val="21"/>
-              </w:rPr>
-              <w:t>Msc</w:t>
-            </w:r>
-            <w:proofErr w:type="spellEnd"/>
-            <w:r>
-              <w:rPr>
-                <w:rFonts w:ascii="Times New Roman" w:hAnsi="Times New Roman" w:cs="Times New Roman"/>
-                <w:color w:val="000000"/>
-                <w:sz w:val="21"/>
-              </w:rPr>
-              <w:t>.</w:t>
+              <w:t>Leonardo Montes Marin Ing. Msc.</w:t>
             </w:r>
             <w:r>
               <w:rPr>
@@ -1211,23 +1164,7 @@
           <w:sz w:val="22"/>
           <w:szCs w:val="22"/>
         </w:rPr>
-        <w:t>La clase Persona se propone como clase base para Jugador y director</w:t>
-      </w:r>
-      <w:r>
-        <w:rPr>
-          <w:rFonts w:ascii="Times New Roman" w:hAnsi="Times New Roman" w:cs="Times New Roman"/>
-          <w:sz w:val="22"/>
-          <w:szCs w:val="22"/>
-        </w:rPr>
-        <w:t xml:space="preserve"> té</w:t>
-      </w:r>
-      <w:r>
-        <w:rPr>
-          <w:rFonts w:ascii="Times New Roman" w:hAnsi="Times New Roman" w:cs="Times New Roman"/>
-          <w:sz w:val="22"/>
-          <w:szCs w:val="22"/>
-        </w:rPr>
-        <w:t>cnico, debido a que ambas comparten características comunes como nombre, edad y nacionalidad.</w:t>
+        <w:t>La clase Persona se propone como clase base para Jugador y DirectorTecnico, debido a que ambas comparten los atributos nombre, apellido, edad y nacionalidad.</w:t>
       </w:r>
     </w:p>
     <w:tbl>
@@ -1320,7 +1257,7 @@
                 <w:sz w:val="22"/>
                 <w:szCs w:val="22"/>
               </w:rPr>
-              <w:t xml:space="preserve">Torneo </w:t>
+              <w:t>Torneo</w:t>
             </w:r>
           </w:p>
         </w:tc>
@@ -1343,7 +1280,7 @@
                 <w:sz w:val="22"/>
                 <w:szCs w:val="22"/>
               </w:rPr>
-              <w:t>Nombre, año, sede, grupos, partidos, selecciones.</w:t>
+              <w:t>nombre, año, sede, grupos, partidos, selecciones.</w:t>
             </w:r>
           </w:p>
         </w:tc>
@@ -1395,7 +1332,7 @@
                 <w:sz w:val="22"/>
                 <w:szCs w:val="22"/>
               </w:rPr>
-              <w:t>Nombre, Selecciones, partidos.</w:t>
+              <w:t>nombre, selecciones, partidos.</w:t>
             </w:r>
           </w:p>
         </w:tc>
@@ -1427,7 +1364,7 @@
                 <w:sz w:val="22"/>
                 <w:szCs w:val="22"/>
               </w:rPr>
-              <w:t>Selección</w:t>
+              <w:t>Seleccion</w:t>
             </w:r>
           </w:p>
         </w:tc>
@@ -1450,7 +1387,7 @@
                 <w:sz w:val="22"/>
                 <w:szCs w:val="22"/>
               </w:rPr>
-              <w:t>Nombre, País, Confederación, jugadores, director técnico, estadística.</w:t>
+              <w:t>nombre, pais, confederacion, jugadores, directorTecnico, estadistica.</w:t>
             </w:r>
           </w:p>
         </w:tc>
@@ -1502,23 +1439,7 @@
                 <w:sz w:val="22"/>
                 <w:szCs w:val="22"/>
               </w:rPr>
-              <w:t>Nombre,</w:t>
-            </w:r>
-            <w:r>
-              <w:rPr>
-                <w:rFonts w:ascii="Times New Roman" w:hAnsi="Times New Roman" w:cs="Times New Roman"/>
-                <w:sz w:val="22"/>
-                <w:szCs w:val="22"/>
-              </w:rPr>
-              <w:t xml:space="preserve"> apellido, </w:t>
-            </w:r>
-            <w:r>
-              <w:rPr>
-                <w:rFonts w:ascii="Times New Roman" w:hAnsi="Times New Roman" w:cs="Times New Roman"/>
-                <w:sz w:val="22"/>
-                <w:szCs w:val="22"/>
-              </w:rPr>
-              <w:t>edad, nacionalidad.</w:t>
+              <w:t>nombre, apellido, edad, nacionalidad.</w:t>
             </w:r>
           </w:p>
         </w:tc>
@@ -1565,31 +1486,13 @@
                 <w:rStyle w:val="Textoennegrita"/>
               </w:rPr>
             </w:pPr>
-            <w:proofErr w:type="spellStart"/>
-            <w:r>
-              <w:rPr>
-                <w:rFonts w:ascii="Times New Roman" w:hAnsi="Times New Roman" w:cs="Times New Roman"/>
-                <w:sz w:val="22"/>
-                <w:szCs w:val="22"/>
-              </w:rPr>
-              <w:t>Numero</w:t>
-            </w:r>
-            <w:proofErr w:type="spellEnd"/>
-            <w:r>
-              <w:rPr>
-                <w:rFonts w:ascii="Times New Roman" w:hAnsi="Times New Roman" w:cs="Times New Roman"/>
-                <w:sz w:val="22"/>
-                <w:szCs w:val="22"/>
-              </w:rPr>
-              <w:t>, posición</w:t>
-            </w:r>
-            <w:r>
-              <w:rPr>
-                <w:rFonts w:ascii="Times New Roman" w:hAnsi="Times New Roman" w:cs="Times New Roman"/>
-                <w:sz w:val="22"/>
-                <w:szCs w:val="22"/>
-              </w:rPr>
-              <w:t>.</w:t>
+            <w:r>
+              <w:rPr>
+                <w:rFonts w:ascii="Times New Roman" w:hAnsi="Times New Roman" w:cs="Times New Roman"/>
+                <w:sz w:val="22"/>
+                <w:szCs w:val="22"/>
+              </w:rPr>
+              <w:t>posicion, numero.</w:t>
             </w:r>
           </w:p>
           <w:p>
@@ -1628,7 +1531,7 @@
                 <w:sz w:val="22"/>
                 <w:szCs w:val="22"/>
               </w:rPr>
-              <w:t>Director técnico</w:t>
+              <w:t>DirectorTecnico</w:t>
             </w:r>
           </w:p>
         </w:tc>
@@ -1651,7 +1554,7 @@
                 <w:sz w:val="22"/>
                 <w:szCs w:val="22"/>
               </w:rPr>
-              <w:t>Años de experiencia, estilos de juego.</w:t>
+              <w:t>experiencia, estiloDeJuego.</w:t>
             </w:r>
           </w:p>
         </w:tc>
@@ -1706,39 +1609,7 @@
                 <w:sz w:val="22"/>
                 <w:szCs w:val="22"/>
               </w:rPr>
-              <w:t xml:space="preserve">Selección local, selección visitante, </w:t>
-            </w:r>
-            <w:r>
-              <w:rPr>
-                <w:rFonts w:ascii="Times New Roman" w:hAnsi="Times New Roman" w:cs="Times New Roman"/>
-                <w:sz w:val="22"/>
-                <w:szCs w:val="22"/>
-              </w:rPr>
-              <w:t>goles locales</w:t>
-            </w:r>
-            <w:r>
-              <w:rPr>
-                <w:rFonts w:ascii="Times New Roman" w:hAnsi="Times New Roman" w:cs="Times New Roman"/>
-                <w:sz w:val="22"/>
-                <w:szCs w:val="22"/>
-              </w:rPr>
-              <w:t xml:space="preserve">, </w:t>
-            </w:r>
-            <w:r>
-              <w:rPr>
-                <w:rFonts w:ascii="Times New Roman" w:hAnsi="Times New Roman" w:cs="Times New Roman"/>
-                <w:sz w:val="22"/>
-                <w:szCs w:val="22"/>
-              </w:rPr>
-              <w:t>goles visitantes</w:t>
-            </w:r>
-            <w:r>
-              <w:rPr>
-                <w:rFonts w:ascii="Times New Roman" w:hAnsi="Times New Roman" w:cs="Times New Roman"/>
-                <w:sz w:val="22"/>
-                <w:szCs w:val="22"/>
-              </w:rPr>
-              <w:t>, fecha, estado.</w:t>
+              <w:t>seleccionLocal, seleccionVisitante, fecha, golesLocal, golesVisitante, estado.</w:t>
             </w:r>
           </w:p>
         </w:tc>
@@ -1767,7 +1638,7 @@
                 <w:sz w:val="22"/>
                 <w:szCs w:val="22"/>
               </w:rPr>
-              <w:t xml:space="preserve">Estadística de Selección </w:t>
+              <w:t>EstadisticaDeSeleccion</w:t>
             </w:r>
           </w:p>
         </w:tc>
@@ -1790,7 +1661,7 @@
                 <w:sz w:val="22"/>
                 <w:szCs w:val="22"/>
               </w:rPr>
-              <w:t>Puntos, partidos jugados, partidos ganados, partidos empatados, partidos perdidos, goles a favor, goles en contra, diferencia de gol.</w:t>
+              <w:t>puntos, partidosJugados, partidosGanados, partidosPerdidos, partidosEmpatados, golesAFavor, golesEnContra, diferenciaDeGoles.</w:t>
             </w:r>
           </w:p>
         </w:tc>
@@ -3213,33 +3084,15 @@
                 <w:sz w:val="22"/>
                 <w:szCs w:val="22"/>
               </w:rPr>
-              <w:t xml:space="preserve"> (3 puntos por victoria, 1 punto por empate y 0 por derrota</w:t>
-            </w:r>
-            <w:proofErr w:type="gramStart"/>
-            <w:r>
-              <w:rPr>
-                <w:rFonts w:ascii="Times New Roman" w:hAnsi="Times New Roman" w:cs="Times New Roman"/>
-                <w:sz w:val="22"/>
-                <w:szCs w:val="22"/>
-              </w:rPr>
-              <w:t xml:space="preserve">) </w:t>
-            </w:r>
-            <w:r>
-              <w:rPr>
-                <w:rFonts w:ascii="Times New Roman" w:hAnsi="Times New Roman" w:cs="Times New Roman"/>
-                <w:sz w:val="22"/>
-                <w:szCs w:val="22"/>
-              </w:rPr>
-              <w:t>,</w:t>
-            </w:r>
-            <w:proofErr w:type="gramEnd"/>
-            <w:r>
-              <w:rPr>
-                <w:rFonts w:ascii="Times New Roman" w:hAnsi="Times New Roman" w:cs="Times New Roman"/>
-                <w:sz w:val="22"/>
-                <w:szCs w:val="22"/>
-              </w:rPr>
-              <w:t xml:space="preserve"> partidos jugados, partidos ganados, empatados y perdidos.</w:t>
+              <w:t xml:space="preserve"> (3 puntos por victoria, 1 punto por empate y 0 por derrota) </w:t>
+            </w:r>
+            <w:r>
+              <w:rPr>
+                <w:rFonts w:ascii="Times New Roman" w:hAnsi="Times New Roman" w:cs="Times New Roman"/>
+                <w:sz w:val="22"/>
+                <w:szCs w:val="22"/>
+              </w:rPr>
+              <w:t>, partidos jugados, partidos ganados, empatados y perdidos.</w:t>
             </w:r>
           </w:p>
         </w:tc>
@@ -3813,7 +3666,23 @@
           <w:sz w:val="22"/>
           <w:szCs w:val="22"/>
         </w:rPr>
-        <w:t>La solución estará estructurada mediante clases y objetos que representen las entidades principales del sistema, aplicando principios de encapsulamiento, herencia y organización modular. Para el almacenamiento de la información se utilizarán archivos CSV como mecanismo de persistencia, permitiendo guardar y consultar los datos del torneo de forma sencilla.</w:t>
+        <w:t xml:space="preserve">La solución estará estructurada mediante clases y objetos que representen las entidades principales del sistema, aplicando principios de encapsulamiento, herencia y organización modular. Para el almacenamiento de la información se utilizarán archivos </w:t>
+      </w:r>
+      <w:r>
+        <w:rPr>
+          <w:rFonts w:ascii="Times New Roman" w:hAnsi="Times New Roman" w:cs="Times New Roman"/>
+          <w:sz w:val="22"/>
+          <w:szCs w:val="22"/>
+        </w:rPr>
+        <w:t>JSON</w:t>
+      </w:r>
+      <w:r>
+        <w:rPr>
+          <w:rFonts w:ascii="Times New Roman" w:hAnsi="Times New Roman" w:cs="Times New Roman"/>
+          <w:sz w:val="22"/>
+          <w:szCs w:val="22"/>
+        </w:rPr>
+        <w:t xml:space="preserve"> como mecanismo de persistencia, permitiendo guardar y consultar los datos del torneo de forma sencilla.</w:t>
       </w:r>
     </w:p>
     <w:p>

</xml_diff>